<commit_message>
LNI-317: Fixed failing tests.
</commit_message>
<xml_diff>
--- a/test/lawmaker/uksi/test2.docx
+++ b/test/lawmaker/uksi/test2.docx
@@ -777,6 +777,10 @@
     <w:p>
       <w:pPr>
         <w:pStyle w:val="N2"/>
+        <w:numPr>
+          <w:ilvl w:val="1"/>
+          <w:numId w:val="17"/>
+        </w:numPr>
       </w:pPr>
       <w:r>
         <w:t xml:space="preserve">These Regulations </w:t>
@@ -930,6 +934,10 @@
     <w:p>
       <w:pPr>
         <w:pStyle w:val="N2"/>
+        <w:numPr>
+          <w:ilvl w:val="1"/>
+          <w:numId w:val="18"/>
+        </w:numPr>
       </w:pPr>
       <w:r>
         <w:t>In</w:t>
@@ -2201,7 +2209,7 @@
   <w:abstractNum w:abstractNumId="3" w15:restartNumberingAfterBreak="0">
     <w:nsid w:val="62CE42E1"/>
     <w:multiLevelType w:val="multilevel"/>
-    <w:tmpl w:val="4B60FC22"/>
+    <w:tmpl w:val="CFD82C56"/>
     <w:name w:val="seq1"/>
     <w:lvl w:ilvl="0">
       <w:start w:val="1"/>
@@ -2665,6 +2673,66 @@
       <w:startOverride w:val="1"/>
     </w:lvlOverride>
   </w:num>
+  <w:num w:numId="17">
+    <w:abstractNumId w:val="3"/>
+    <w:lvlOverride w:ilvl="0">
+      <w:startOverride w:val="1"/>
+    </w:lvlOverride>
+    <w:lvlOverride w:ilvl="1">
+      <w:startOverride w:val="2"/>
+    </w:lvlOverride>
+    <w:lvlOverride w:ilvl="2">
+      <w:startOverride w:val="1"/>
+    </w:lvlOverride>
+    <w:lvlOverride w:ilvl="3">
+      <w:startOverride w:val="1"/>
+    </w:lvlOverride>
+    <w:lvlOverride w:ilvl="4">
+      <w:startOverride w:val="1"/>
+    </w:lvlOverride>
+    <w:lvlOverride w:ilvl="5">
+      <w:startOverride w:val="1"/>
+    </w:lvlOverride>
+    <w:lvlOverride w:ilvl="6">
+      <w:startOverride w:val="1"/>
+    </w:lvlOverride>
+    <w:lvlOverride w:ilvl="7">
+      <w:startOverride w:val="1"/>
+    </w:lvlOverride>
+    <w:lvlOverride w:ilvl="8">
+      <w:startOverride w:val="1"/>
+    </w:lvlOverride>
+  </w:num>
+  <w:num w:numId="18">
+    <w:abstractNumId w:val="3"/>
+    <w:lvlOverride w:ilvl="0">
+      <w:startOverride w:val="2"/>
+    </w:lvlOverride>
+    <w:lvlOverride w:ilvl="1">
+      <w:startOverride w:val="2"/>
+    </w:lvlOverride>
+    <w:lvlOverride w:ilvl="2">
+      <w:startOverride w:val="1"/>
+    </w:lvlOverride>
+    <w:lvlOverride w:ilvl="3">
+      <w:startOverride w:val="1"/>
+    </w:lvlOverride>
+    <w:lvlOverride w:ilvl="4">
+      <w:startOverride w:val="1"/>
+    </w:lvlOverride>
+    <w:lvlOverride w:ilvl="5">
+      <w:startOverride w:val="1"/>
+    </w:lvlOverride>
+    <w:lvlOverride w:ilvl="6">
+      <w:startOverride w:val="1"/>
+    </w:lvlOverride>
+    <w:lvlOverride w:ilvl="7">
+      <w:startOverride w:val="1"/>
+    </w:lvlOverride>
+    <w:lvlOverride w:ilvl="8">
+      <w:startOverride w:val="1"/>
+    </w:lvlOverride>
+  </w:num>
 </w:numbering>
 </file>
 
@@ -6703,6 +6771,10 @@
 </file>
 
 <file path=customXml/item1.xml><?xml version="1.0" encoding="utf-8"?>
+<b:Sources xmlns:b="http://schemas.openxmlformats.org/officeDocument/2006/bibliography" xmlns="http://schemas.openxmlformats.org/officeDocument/2006/bibliography" SelectedStyle="\APASixthEditionOfficeOnline.xsl" StyleName="APA" Version="6"/>
+</file>
+
+<file path=customXml/item2.xml><?xml version="1.0" encoding="utf-8"?>
 <p:properties xmlns:p="http://schemas.microsoft.com/office/2006/metadata/properties" xmlns:xsi="http://www.w3.org/2001/XMLSchema-instance" xmlns:pc="http://schemas.microsoft.com/office/infopath/2007/PartnerControls">
   <documentManagement>
     <dlc_EmailTo xmlns="15ff3d39-6e7b-4d70-9b7c-8d9fe85d0f29" xsi:nil="true"/>
@@ -6725,11 +6797,16 @@
 </p:properties>
 </file>
 
-<file path=customXml/item2.xml><?xml version="1.0" encoding="utf-8"?>
-<b:Sources xmlns:b="http://schemas.openxmlformats.org/officeDocument/2006/bibliography" xmlns="http://schemas.openxmlformats.org/officeDocument/2006/bibliography" SelectedStyle="\APASixthEditionOfficeOnline.xsl" StyleName="APA" Version="6"/>
+<file path=customXml/item3.xml><?xml version="1.0" encoding="utf-8"?>
+<?mso-contentType ?>
+<FormTemplates xmlns="http://schemas.microsoft.com/sharepoint/v3/contenttype/forms">
+  <Display>DocumentLibraryForm</Display>
+  <Edit>DocumentLibraryForm</Edit>
+  <New>DocumentLibraryForm</New>
+</FormTemplates>
 </file>
 
-<file path=customXml/item3.xml><?xml version="1.0" encoding="utf-8"?>
+<file path=customXml/item4.xml><?xml version="1.0" encoding="utf-8"?>
 <ct:contentTypeSchema xmlns:ct="http://schemas.microsoft.com/office/2006/metadata/contentType" xmlns:ma="http://schemas.microsoft.com/office/2006/metadata/properties/metaAttributes" ct:_="" ma:_="" ma:contentTypeName="Document" ma:contentTypeID="0x010100474C26AD8136644489EFB0969FAC5A66" ma:contentTypeVersion="12" ma:contentTypeDescription="Create a new document." ma:contentTypeScope="" ma:versionID="f332db9b35ad6afdc6b2aac78c8f118b">
   <xsd:schema xmlns:xsd="http://www.w3.org/2001/XMLSchema" xmlns:xs="http://www.w3.org/2001/XMLSchema" xmlns:p="http://schemas.microsoft.com/office/2006/metadata/properties" xmlns:ns2="239e201e-ef3d-45da-b26c-a20f37c33f42" xmlns:ns3="15ff3d39-6e7b-4d70-9b7c-8d9fe85d0f29" xmlns:ns4="61d55175-a717-42f9-b0fc-22ceaeba7fb6" targetNamespace="http://schemas.microsoft.com/office/2006/metadata/properties" ma:root="true" ma:fieldsID="6adfa997ab2d0d13fe3ad59f920fd64e" ns2:_="" ns3:_="" ns4:_="">
     <xsd:import namespace="239e201e-ef3d-45da-b26c-a20f37c33f42"/>
@@ -7048,16 +7125,15 @@
 </ct:contentTypeSchema>
 </file>
 
-<file path=customXml/item4.xml><?xml version="1.0" encoding="utf-8"?>
-<?mso-contentType ?>
-<FormTemplates xmlns="http://schemas.microsoft.com/sharepoint/v3/contenttype/forms">
-  <Display>DocumentLibraryForm</Display>
-  <Edit>DocumentLibraryForm</Edit>
-  <New>DocumentLibraryForm</New>
-</FormTemplates>
+<file path=customXml/itemProps1.xml><?xml version="1.0" encoding="utf-8"?>
+<ds:datastoreItem xmlns:ds="http://schemas.openxmlformats.org/officeDocument/2006/customXml" ds:itemID="{53429665-342A-446D-9F8A-9882A4F50562}">
+  <ds:schemaRefs>
+    <ds:schemaRef ds:uri="http://schemas.openxmlformats.org/officeDocument/2006/bibliography"/>
+  </ds:schemaRefs>
+</ds:datastoreItem>
 </file>
 
-<file path=customXml/itemProps1.xml><?xml version="1.0" encoding="utf-8"?>
+<file path=customXml/itemProps2.xml><?xml version="1.0" encoding="utf-8"?>
 <ds:datastoreItem xmlns:ds="http://schemas.openxmlformats.org/officeDocument/2006/customXml" ds:itemID="{36B93B7A-46B7-4586-8939-1CD267361017}">
   <ds:schemaRefs>
     <ds:schemaRef ds:uri="http://schemas.microsoft.com/office/2006/metadata/properties"/>
@@ -7068,15 +7144,15 @@
 </ds:datastoreItem>
 </file>
 
-<file path=customXml/itemProps2.xml><?xml version="1.0" encoding="utf-8"?>
-<ds:datastoreItem xmlns:ds="http://schemas.openxmlformats.org/officeDocument/2006/customXml" ds:itemID="{53429665-342A-446D-9F8A-9882A4F50562}">
+<file path=customXml/itemProps3.xml><?xml version="1.0" encoding="utf-8"?>
+<ds:datastoreItem xmlns:ds="http://schemas.openxmlformats.org/officeDocument/2006/customXml" ds:itemID="{5EE34D3D-F7AF-4CA7-9845-9B51A9E317B9}">
   <ds:schemaRefs>
-    <ds:schemaRef ds:uri="http://schemas.openxmlformats.org/officeDocument/2006/bibliography"/>
+    <ds:schemaRef ds:uri="http://schemas.microsoft.com/sharepoint/v3/contenttype/forms"/>
   </ds:schemaRefs>
 </ds:datastoreItem>
 </file>
 
-<file path=customXml/itemProps3.xml><?xml version="1.0" encoding="utf-8"?>
+<file path=customXml/itemProps4.xml><?xml version="1.0" encoding="utf-8"?>
 <ds:datastoreItem xmlns:ds="http://schemas.openxmlformats.org/officeDocument/2006/customXml" ds:itemID="{EEC1151F-33A4-42BB-BBA1-B13332885A4C}">
   <ds:schemaRefs>
     <ds:schemaRef ds:uri="http://schemas.microsoft.com/office/2006/metadata/contentType"/>
@@ -7096,14 +7172,6 @@
 </ds:datastoreItem>
 </file>
 
-<file path=customXml/itemProps4.xml><?xml version="1.0" encoding="utf-8"?>
-<ds:datastoreItem xmlns:ds="http://schemas.openxmlformats.org/officeDocument/2006/customXml" ds:itemID="{5EE34D3D-F7AF-4CA7-9845-9B51A9E317B9}">
-  <ds:schemaRefs>
-    <ds:schemaRef ds:uri="http://schemas.microsoft.com/sharepoint/v3/contenttype/forms"/>
-  </ds:schemaRefs>
-</ds:datastoreItem>
-</file>
-
 <file path=docMetadata/LabelInfo.xml><?xml version="1.0" encoding="utf-8"?>
 <clbl:labelList xmlns:clbl="http://schemas.microsoft.com/office/2020/mipLabelMetadata">
   <clbl:label id="{f0c28fc3-7798-4269-87f4-d58050cd53cb}" enabled="1" method="Privileged" siteId="{28b782fb-41e1-48ea-bfc3-ad7558ce7136}" removed="0"/>

</xml_diff>